<commit_message>
Update Lab 3 report with student ID and content improvements
</commit_message>
<xml_diff>
--- a/lab-3/option-vercel/docs/Informe_Laboratorio_3_Ian_Cumes.docx
+++ b/lab-3/option-vercel/docs/Informe_Laboratorio_3_Ian_Cumes.docx
@@ -5,111 +5,354 @@
     <w:p>
       <w:pPr>
         <w:spacing w:before="160" w:after="60"/>
+        <w:rPr>
+          <w:lang w:val="es-US"/>
+        </w:rPr>
       </w:pPr>
       <w:r>
         <w:rPr>
           <w:b/>
           <w:color w:val="2E74B5"/>
           <w:sz w:val="21"/>
-        </w:rPr>
-        <w:t>INFORME TECNICO</w:t>
+          <w:lang w:val="es-US"/>
+        </w:rPr>
+        <w:t xml:space="preserve">INFORME </w:t>
       </w:r>
     </w:p>
     <w:p>
       <w:pPr>
         <w:spacing w:after="60"/>
+        <w:rPr>
+          <w:lang w:val="es-US"/>
+        </w:rPr>
       </w:pPr>
       <w:r>
         <w:rPr>
           <w:b/>
           <w:color w:val="111827"/>
           <w:sz w:val="46"/>
-        </w:rPr>
-        <w:t>Del archivo .sl a un sitio en produccion</w:t>
-      </w:r>
+          <w:lang w:val="es-US"/>
+        </w:rPr>
+        <w:t>Del archivo .</w:t>
+      </w:r>
+      <w:proofErr w:type="spellStart"/>
+      <w:r>
+        <w:rPr>
+          <w:b/>
+          <w:color w:val="111827"/>
+          <w:sz w:val="46"/>
+          <w:lang w:val="es-US"/>
+        </w:rPr>
+        <w:t>sl</w:t>
+      </w:r>
+      <w:proofErr w:type="spellEnd"/>
+      <w:r>
+        <w:rPr>
+          <w:b/>
+          <w:color w:val="111827"/>
+          <w:sz w:val="46"/>
+          <w:lang w:val="es-US"/>
+        </w:rPr>
+        <w:t xml:space="preserve"> a un sitio en </w:t>
+      </w:r>
+      <w:proofErr w:type="spellStart"/>
+      <w:r>
+        <w:rPr>
+          <w:b/>
+          <w:color w:val="111827"/>
+          <w:sz w:val="46"/>
+          <w:lang w:val="es-US"/>
+        </w:rPr>
+        <w:t>produccion</w:t>
+      </w:r>
+      <w:proofErr w:type="spellEnd"/>
     </w:p>
     <w:p>
       <w:pPr>
         <w:spacing w:after="240"/>
+        <w:rPr>
+          <w:lang w:val="es-US"/>
+        </w:rPr>
       </w:pPr>
       <w:r>
         <w:rPr>
           <w:color w:val="4B5563"/>
           <w:sz w:val="26"/>
-        </w:rPr>
-        <w:t>Laboratorio 3 · Opcion D: GitHub + Vercel</w:t>
-      </w:r>
+          <w:lang w:val="es-US"/>
+        </w:rPr>
+        <w:t xml:space="preserve">Laboratorio 3 · </w:t>
+      </w:r>
+      <w:proofErr w:type="spellStart"/>
+      <w:r>
+        <w:rPr>
+          <w:color w:val="4B5563"/>
+          <w:sz w:val="26"/>
+          <w:lang w:val="es-US"/>
+        </w:rPr>
+        <w:t>Opcion</w:t>
+      </w:r>
+      <w:proofErr w:type="spellEnd"/>
+      <w:r>
+        <w:rPr>
+          <w:color w:val="4B5563"/>
+          <w:sz w:val="26"/>
+          <w:lang w:val="es-US"/>
+        </w:rPr>
+        <w:t xml:space="preserve"> D: GitHub + </w:t>
+      </w:r>
+      <w:proofErr w:type="spellStart"/>
+      <w:r>
+        <w:rPr>
+          <w:color w:val="4B5563"/>
+          <w:sz w:val="26"/>
+          <w:lang w:val="es-US"/>
+        </w:rPr>
+        <w:t>Vercel</w:t>
+      </w:r>
+      <w:proofErr w:type="spellEnd"/>
     </w:p>
     <w:p>
       <w:pPr>
         <w:spacing w:after="30"/>
+        <w:rPr>
+          <w:lang w:val="es-US"/>
+        </w:rPr>
       </w:pPr>
       <w:r>
         <w:rPr>
           <w:b/>
           <w:sz w:val="21"/>
+          <w:lang w:val="es-US"/>
         </w:rPr>
         <w:t xml:space="preserve">Estudiante: </w:t>
       </w:r>
       <w:r>
         <w:rPr>
           <w:sz w:val="21"/>
+          <w:lang w:val="es-US"/>
         </w:rPr>
         <w:t>Ian Cumes</w:t>
+      </w:r>
+      <w:r>
+        <w:rPr>
+          <w:sz w:val="21"/>
+          <w:lang w:val="es-US"/>
+        </w:rPr>
+        <w:t xml:space="preserve"> 23236</w:t>
       </w:r>
     </w:p>
     <w:p>
       <w:pPr>
         <w:spacing w:after="30"/>
+        <w:rPr>
+          <w:lang w:val="es-US"/>
+        </w:rPr>
       </w:pPr>
       <w:r>
         <w:rPr>
           <w:b/>
           <w:sz w:val="21"/>
+          <w:lang w:val="es-US"/>
         </w:rPr>
         <w:t xml:space="preserve">Curso: </w:t>
       </w:r>
+      <w:proofErr w:type="spellStart"/>
       <w:r>
         <w:rPr>
           <w:sz w:val="21"/>
-        </w:rPr>
-        <w:t>Construccion de Compiladores</w:t>
+          <w:lang w:val="es-US"/>
+        </w:rPr>
+        <w:t>Construccion</w:t>
+      </w:r>
+      <w:proofErr w:type="spellEnd"/>
+      <w:r>
+        <w:rPr>
+          <w:sz w:val="21"/>
+          <w:lang w:val="es-US"/>
+        </w:rPr>
+        <w:t xml:space="preserve"> de Compiladores</w:t>
       </w:r>
     </w:p>
     <w:p>
       <w:pPr>
         <w:spacing w:after="30"/>
+        <w:rPr>
+          <w:lang w:val="es-US"/>
+        </w:rPr>
       </w:pPr>
       <w:r>
         <w:rPr>
           <w:b/>
           <w:sz w:val="21"/>
-        </w:rPr>
-        <w:t xml:space="preserve">Institucion: </w:t>
+          <w:lang w:val="es-US"/>
+        </w:rPr>
+        <w:t xml:space="preserve">Fecha: </w:t>
       </w:r>
       <w:r>
         <w:rPr>
           <w:sz w:val="21"/>
-        </w:rPr>
-        <w:t>Universidad del Valle de Guatemala</w:t>
+          <w:lang w:val="es-US"/>
+        </w:rPr>
+        <w:t>2 de agosto de 2026</w:t>
       </w:r>
     </w:p>
     <w:p>
       <w:pPr>
-        <w:spacing w:after="30"/>
+        <w:pStyle w:val="Heading1"/>
+        <w:rPr>
+          <w:lang w:val="es-US"/>
+        </w:rPr>
       </w:pPr>
       <w:r>
         <w:rPr>
-          <w:b/>
-          <w:sz w:val="21"/>
-        </w:rPr>
-        <w:t xml:space="preserve">Fecha: </w:t>
-      </w:r>
-      <w:r>
-        <w:rPr>
-          <w:sz w:val="21"/>
-        </w:rPr>
-        <w:t>2 de agosto de 2026</w:t>
+          <w:lang w:val="es-US"/>
+        </w:rPr>
+        <w:t xml:space="preserve">1. </w:t>
+      </w:r>
+      <w:r>
+        <w:rPr>
+          <w:lang w:val="es-US"/>
+        </w:rPr>
+        <w:t xml:space="preserve">Lo que se </w:t>
+      </w:r>
+      <w:proofErr w:type="spellStart"/>
+      <w:r>
+        <w:rPr>
+          <w:lang w:val="es-US"/>
+        </w:rPr>
+        <w:t>contruyó</w:t>
+      </w:r>
+      <w:proofErr w:type="spellEnd"/>
+    </w:p>
+    <w:p>
+      <w:pPr>
+        <w:rPr>
+          <w:lang w:val="es-US"/>
+        </w:rPr>
+      </w:pPr>
+      <w:proofErr w:type="spellStart"/>
+      <w:r>
+        <w:rPr>
+          <w:lang w:val="es-US"/>
+        </w:rPr>
+        <w:t>SiteLang</w:t>
+      </w:r>
+      <w:proofErr w:type="spellEnd"/>
+      <w:r>
+        <w:rPr>
+          <w:lang w:val="es-US"/>
+        </w:rPr>
+        <w:t xml:space="preserve"> es un lenguaje pequeño para describir una </w:t>
+      </w:r>
+      <w:proofErr w:type="spellStart"/>
+      <w:r>
+        <w:rPr>
+          <w:lang w:val="es-US"/>
+        </w:rPr>
+        <w:t>pagina</w:t>
+      </w:r>
+      <w:proofErr w:type="spellEnd"/>
+      <w:r>
+        <w:rPr>
+          <w:lang w:val="es-US"/>
+        </w:rPr>
+        <w:t xml:space="preserve"> web sin escribir HTML. </w:t>
+      </w:r>
+      <w:r>
+        <w:rPr>
+          <w:lang w:val="es-US"/>
+        </w:rPr>
+        <w:t>El</w:t>
+      </w:r>
+      <w:r>
+        <w:rPr>
+          <w:lang w:val="es-US"/>
+        </w:rPr>
+        <w:t xml:space="preserve"> archivo site.sl contiene el nombre del proyecto, el tema y el contenido. ANTLR lo convierte en tokens, comprueba su estructura y produce el </w:t>
+      </w:r>
+      <w:proofErr w:type="spellStart"/>
+      <w:r>
+        <w:rPr>
+          <w:lang w:val="es-US"/>
+        </w:rPr>
+        <w:t>arbol</w:t>
+      </w:r>
+      <w:proofErr w:type="spellEnd"/>
+      <w:r>
+        <w:rPr>
+          <w:lang w:val="es-US"/>
+        </w:rPr>
+        <w:t xml:space="preserve"> que recorre un </w:t>
+      </w:r>
+      <w:proofErr w:type="spellStart"/>
+      <w:r>
+        <w:rPr>
+          <w:lang w:val="es-US"/>
+        </w:rPr>
+        <w:t>Listener</w:t>
+      </w:r>
+      <w:proofErr w:type="spellEnd"/>
+      <w:r>
+        <w:rPr>
+          <w:lang w:val="es-US"/>
+        </w:rPr>
+        <w:t xml:space="preserve"> de Python. El </w:t>
+      </w:r>
+      <w:proofErr w:type="spellStart"/>
+      <w:r>
+        <w:rPr>
+          <w:lang w:val="es-US"/>
+        </w:rPr>
+        <w:t>Listener</w:t>
+      </w:r>
+      <w:proofErr w:type="spellEnd"/>
+      <w:r>
+        <w:rPr>
+          <w:lang w:val="es-US"/>
+        </w:rPr>
+        <w:t xml:space="preserve"> valida los datos, genera index.html y coordina las llamadas a GitHub y </w:t>
+      </w:r>
+      <w:proofErr w:type="spellStart"/>
+      <w:r>
+        <w:rPr>
+          <w:lang w:val="es-US"/>
+        </w:rPr>
+        <w:t>Vercel</w:t>
+      </w:r>
+      <w:proofErr w:type="spellEnd"/>
+      <w:r>
+        <w:rPr>
+          <w:lang w:val="es-US"/>
+        </w:rPr>
+        <w:t xml:space="preserve">. Durante la prueba final, el mismo comando actualizo el repositorio </w:t>
+      </w:r>
+      <w:proofErr w:type="spellStart"/>
+      <w:r>
+        <w:rPr>
+          <w:lang w:val="es-US"/>
+        </w:rPr>
+        <w:t>publico</w:t>
+      </w:r>
+      <w:proofErr w:type="spellEnd"/>
+      <w:r>
+        <w:rPr>
+          <w:lang w:val="es-US"/>
+        </w:rPr>
+        <w:t xml:space="preserve"> y dejo el </w:t>
+      </w:r>
+      <w:proofErr w:type="spellStart"/>
+      <w:r>
+        <w:rPr>
+          <w:lang w:val="es-US"/>
+        </w:rPr>
+        <w:t>deployment</w:t>
+      </w:r>
+      <w:proofErr w:type="spellEnd"/>
+      <w:r>
+        <w:rPr>
+          <w:lang w:val="es-US"/>
+        </w:rPr>
+        <w:t xml:space="preserve"> en estado READY.</w:t>
       </w:r>
     </w:p>
     <w:p>
@@ -117,99 +360,412 @@
         <w:pStyle w:val="Heading1"/>
       </w:pPr>
       <w:r>
-        <w:t>1. Que construi</w:t>
-      </w:r>
-    </w:p>
-    <w:p>
-      <w:r>
-        <w:t>SiteLang es un lenguaje pequeño para describir una pagina web sin escribir HTML. Mi archivo site.sl contiene el nombre del proyecto, el tema y el contenido. ANTLR lo convierte en tokens, comprueba su estructura y produce el arbol que recorre un Listener de Python. El Listener valida los datos, genera index.html y coordina las llamadas a GitHub y Vercel. Durante la prueba final, el mismo comando actualizo el repositorio publico y dejo el deployment en estado READY.</w:t>
-      </w:r>
-    </w:p>
-    <w:p>
-      <w:pPr>
-        <w:pStyle w:val="Heading1"/>
-      </w:pPr>
-      <w:r>
         <w:t>2. Del DSL al deployment</w:t>
       </w:r>
     </w:p>
     <w:p>
       <w:pPr>
         <w:pStyle w:val="ListNumber"/>
+        <w:rPr>
+          <w:lang w:val="es-US"/>
+        </w:rPr>
       </w:pPr>
+      <w:proofErr w:type="spellStart"/>
       <w:r>
         <w:rPr>
           <w:b/>
-        </w:rPr>
-        <w:t xml:space="preserve">Analisis lexico. </w:t>
-      </w:r>
-      <w:r>
-        <w:t>El lexer reconoce strings, identificadores, numeros, booleanos y simbolos del lenguaje.</w:t>
+          <w:lang w:val="es-US"/>
+        </w:rPr>
+        <w:t>Analisis</w:t>
+      </w:r>
+      <w:proofErr w:type="spellEnd"/>
+      <w:r>
+        <w:rPr>
+          <w:b/>
+          <w:lang w:val="es-US"/>
+        </w:rPr>
+        <w:t xml:space="preserve"> </w:t>
+      </w:r>
+      <w:proofErr w:type="spellStart"/>
+      <w:r>
+        <w:rPr>
+          <w:b/>
+          <w:lang w:val="es-US"/>
+        </w:rPr>
+        <w:t>lexico</w:t>
+      </w:r>
+      <w:proofErr w:type="spellEnd"/>
+      <w:r>
+        <w:rPr>
+          <w:b/>
+          <w:lang w:val="es-US"/>
+        </w:rPr>
+        <w:t xml:space="preserve">. </w:t>
+      </w:r>
+      <w:r>
+        <w:rPr>
+          <w:lang w:val="es-US"/>
+        </w:rPr>
+        <w:t xml:space="preserve">El </w:t>
+      </w:r>
+      <w:proofErr w:type="spellStart"/>
+      <w:r>
+        <w:rPr>
+          <w:lang w:val="es-US"/>
+        </w:rPr>
+        <w:t>lexer</w:t>
+      </w:r>
+      <w:proofErr w:type="spellEnd"/>
+      <w:r>
+        <w:rPr>
+          <w:lang w:val="es-US"/>
+        </w:rPr>
+        <w:t xml:space="preserve"> reconoce </w:t>
+      </w:r>
+      <w:proofErr w:type="spellStart"/>
+      <w:r>
+        <w:rPr>
+          <w:lang w:val="es-US"/>
+        </w:rPr>
+        <w:t>strings</w:t>
+      </w:r>
+      <w:proofErr w:type="spellEnd"/>
+      <w:r>
+        <w:rPr>
+          <w:lang w:val="es-US"/>
+        </w:rPr>
+        <w:t xml:space="preserve">, identificadores, </w:t>
+      </w:r>
+      <w:proofErr w:type="spellStart"/>
+      <w:r>
+        <w:rPr>
+          <w:lang w:val="es-US"/>
+        </w:rPr>
+        <w:t>numeros</w:t>
+      </w:r>
+      <w:proofErr w:type="spellEnd"/>
+      <w:r>
+        <w:rPr>
+          <w:lang w:val="es-US"/>
+        </w:rPr>
+        <w:t xml:space="preserve">, booleanos y </w:t>
+      </w:r>
+      <w:proofErr w:type="spellStart"/>
+      <w:r>
+        <w:rPr>
+          <w:lang w:val="es-US"/>
+        </w:rPr>
+        <w:t>simbolos</w:t>
+      </w:r>
+      <w:proofErr w:type="spellEnd"/>
+      <w:r>
+        <w:rPr>
+          <w:lang w:val="es-US"/>
+        </w:rPr>
+        <w:t xml:space="preserve"> del lenguaje.</w:t>
       </w:r>
     </w:p>
     <w:p>
       <w:pPr>
         <w:pStyle w:val="ListNumber"/>
+        <w:rPr>
+          <w:lang w:val="es-US"/>
+        </w:rPr>
       </w:pPr>
+      <w:proofErr w:type="spellStart"/>
       <w:r>
         <w:rPr>
           <w:b/>
-        </w:rPr>
-        <w:t xml:space="preserve">Analisis sintactico. </w:t>
-      </w:r>
-      <w:r>
-        <w:t>El parser exige un bloque site completo, sus atributos y al menos la estructura de pagina esperada.</w:t>
+          <w:lang w:val="es-US"/>
+        </w:rPr>
+        <w:t>Analisis</w:t>
+      </w:r>
+      <w:proofErr w:type="spellEnd"/>
+      <w:r>
+        <w:rPr>
+          <w:b/>
+          <w:lang w:val="es-US"/>
+        </w:rPr>
+        <w:t xml:space="preserve"> </w:t>
+      </w:r>
+      <w:proofErr w:type="spellStart"/>
+      <w:r>
+        <w:rPr>
+          <w:b/>
+          <w:lang w:val="es-US"/>
+        </w:rPr>
+        <w:t>sintactico</w:t>
+      </w:r>
+      <w:proofErr w:type="spellEnd"/>
+      <w:r>
+        <w:rPr>
+          <w:b/>
+          <w:lang w:val="es-US"/>
+        </w:rPr>
+        <w:t xml:space="preserve">. </w:t>
+      </w:r>
+      <w:r>
+        <w:rPr>
+          <w:lang w:val="es-US"/>
+        </w:rPr>
+        <w:t xml:space="preserve">El </w:t>
+      </w:r>
+      <w:proofErr w:type="spellStart"/>
+      <w:r>
+        <w:rPr>
+          <w:lang w:val="es-US"/>
+        </w:rPr>
+        <w:t>parser</w:t>
+      </w:r>
+      <w:proofErr w:type="spellEnd"/>
+      <w:r>
+        <w:rPr>
+          <w:lang w:val="es-US"/>
+        </w:rPr>
+        <w:t xml:space="preserve"> exige un bloque site completo, sus atributos y al menos la estructura de </w:t>
+      </w:r>
+      <w:proofErr w:type="spellStart"/>
+      <w:r>
+        <w:rPr>
+          <w:lang w:val="es-US"/>
+        </w:rPr>
+        <w:t>pagina</w:t>
+      </w:r>
+      <w:proofErr w:type="spellEnd"/>
+      <w:r>
+        <w:rPr>
+          <w:lang w:val="es-US"/>
+        </w:rPr>
+        <w:t xml:space="preserve"> esperada.</w:t>
       </w:r>
     </w:p>
     <w:p>
       <w:pPr>
         <w:pStyle w:val="ListNumber"/>
+        <w:rPr>
+          <w:lang w:val="es-US"/>
+        </w:rPr>
       </w:pPr>
+      <w:proofErr w:type="spellStart"/>
       <w:r>
         <w:rPr>
           <w:b/>
-        </w:rPr>
-        <w:t xml:space="preserve">Validacion. </w:t>
-      </w:r>
-      <w:r>
-        <w:t>El Listener rechaza temas, URLs, nombres o campos invalidos antes de ejecutar una llamada externa.</w:t>
+          <w:lang w:val="es-US"/>
+        </w:rPr>
+        <w:t>Validacion</w:t>
+      </w:r>
+      <w:proofErr w:type="spellEnd"/>
+      <w:r>
+        <w:rPr>
+          <w:b/>
+          <w:lang w:val="es-US"/>
+        </w:rPr>
+        <w:t xml:space="preserve">. </w:t>
+      </w:r>
+      <w:r>
+        <w:rPr>
+          <w:lang w:val="es-US"/>
+        </w:rPr>
+        <w:t xml:space="preserve">El </w:t>
+      </w:r>
+      <w:proofErr w:type="spellStart"/>
+      <w:r>
+        <w:rPr>
+          <w:lang w:val="es-US"/>
+        </w:rPr>
+        <w:t>Listener</w:t>
+      </w:r>
+      <w:proofErr w:type="spellEnd"/>
+      <w:r>
+        <w:rPr>
+          <w:lang w:val="es-US"/>
+        </w:rPr>
+        <w:t xml:space="preserve"> rechaza temas, </w:t>
+      </w:r>
+      <w:proofErr w:type="spellStart"/>
+      <w:r>
+        <w:rPr>
+          <w:lang w:val="es-US"/>
+        </w:rPr>
+        <w:t>URLs</w:t>
+      </w:r>
+      <w:proofErr w:type="spellEnd"/>
+      <w:r>
+        <w:rPr>
+          <w:lang w:val="es-US"/>
+        </w:rPr>
+        <w:t xml:space="preserve">, nombres o campos </w:t>
+      </w:r>
+      <w:proofErr w:type="spellStart"/>
+      <w:r>
+        <w:rPr>
+          <w:lang w:val="es-US"/>
+        </w:rPr>
+        <w:t>invalidos</w:t>
+      </w:r>
+      <w:proofErr w:type="spellEnd"/>
+      <w:r>
+        <w:rPr>
+          <w:lang w:val="es-US"/>
+        </w:rPr>
+        <w:t xml:space="preserve"> antes de ejecutar una llamada externa.</w:t>
       </w:r>
     </w:p>
     <w:p>
       <w:pPr>
         <w:pStyle w:val="ListNumber"/>
+        <w:rPr>
+          <w:lang w:val="es-US"/>
+        </w:rPr>
       </w:pPr>
+      <w:proofErr w:type="spellStart"/>
       <w:r>
         <w:rPr>
           <w:b/>
-        </w:rPr>
-        <w:t xml:space="preserve">Generacion. </w:t>
-      </w:r>
-      <w:r>
-        <w:t>Los valores del arbol se escapan y se insertan en una pagina HTML adaptable a movil.</w:t>
+          <w:lang w:val="es-US"/>
+        </w:rPr>
+        <w:t>Generacion</w:t>
+      </w:r>
+      <w:proofErr w:type="spellEnd"/>
+      <w:r>
+        <w:rPr>
+          <w:b/>
+          <w:lang w:val="es-US"/>
+        </w:rPr>
+        <w:t xml:space="preserve">. </w:t>
+      </w:r>
+      <w:r>
+        <w:rPr>
+          <w:lang w:val="es-US"/>
+        </w:rPr>
+        <w:t xml:space="preserve">Los valores del </w:t>
+      </w:r>
+      <w:proofErr w:type="spellStart"/>
+      <w:r>
+        <w:rPr>
+          <w:lang w:val="es-US"/>
+        </w:rPr>
+        <w:t>arbol</w:t>
+      </w:r>
+      <w:proofErr w:type="spellEnd"/>
+      <w:r>
+        <w:rPr>
+          <w:lang w:val="es-US"/>
+        </w:rPr>
+        <w:t xml:space="preserve"> se escapan y se insertan en una </w:t>
+      </w:r>
+      <w:proofErr w:type="spellStart"/>
+      <w:r>
+        <w:rPr>
+          <w:lang w:val="es-US"/>
+        </w:rPr>
+        <w:t>pagina</w:t>
+      </w:r>
+      <w:proofErr w:type="spellEnd"/>
+      <w:r>
+        <w:rPr>
+          <w:lang w:val="es-US"/>
+        </w:rPr>
+        <w:t xml:space="preserve"> HTML adaptable a </w:t>
+      </w:r>
+      <w:proofErr w:type="spellStart"/>
+      <w:r>
+        <w:rPr>
+          <w:lang w:val="es-US"/>
+        </w:rPr>
+        <w:t>movil</w:t>
+      </w:r>
+      <w:proofErr w:type="spellEnd"/>
+      <w:r>
+        <w:rPr>
+          <w:lang w:val="es-US"/>
+        </w:rPr>
+        <w:t>.</w:t>
       </w:r>
     </w:p>
     <w:p>
       <w:pPr>
         <w:pStyle w:val="ListNumber"/>
+        <w:rPr>
+          <w:lang w:val="es-US"/>
+        </w:rPr>
       </w:pPr>
+      <w:proofErr w:type="spellStart"/>
       <w:r>
         <w:rPr>
           <w:b/>
-        </w:rPr>
-        <w:t xml:space="preserve">Publicacion. </w:t>
-      </w:r>
-      <w:r>
-        <w:t>La API de GitHub actualiza index.html y la API de Vercel crea el deployment de produccion.</w:t>
+          <w:lang w:val="es-US"/>
+        </w:rPr>
+        <w:t>Publicacion</w:t>
+      </w:r>
+      <w:proofErr w:type="spellEnd"/>
+      <w:r>
+        <w:rPr>
+          <w:b/>
+          <w:lang w:val="es-US"/>
+        </w:rPr>
+        <w:t xml:space="preserve">. </w:t>
+      </w:r>
+      <w:r>
+        <w:rPr>
+          <w:lang w:val="es-US"/>
+        </w:rPr>
+        <w:t xml:space="preserve">La API de GitHub actualiza index.html y la API de </w:t>
+      </w:r>
+      <w:proofErr w:type="spellStart"/>
+      <w:r>
+        <w:rPr>
+          <w:lang w:val="es-US"/>
+        </w:rPr>
+        <w:t>Vercel</w:t>
+      </w:r>
+      <w:proofErr w:type="spellEnd"/>
+      <w:r>
+        <w:rPr>
+          <w:lang w:val="es-US"/>
+        </w:rPr>
+        <w:t xml:space="preserve"> crea el </w:t>
+      </w:r>
+      <w:proofErr w:type="spellStart"/>
+      <w:r>
+        <w:rPr>
+          <w:lang w:val="es-US"/>
+        </w:rPr>
+        <w:t>deployment</w:t>
+      </w:r>
+      <w:proofErr w:type="spellEnd"/>
+      <w:r>
+        <w:rPr>
+          <w:lang w:val="es-US"/>
+        </w:rPr>
+        <w:t xml:space="preserve"> de </w:t>
+      </w:r>
+      <w:proofErr w:type="spellStart"/>
+      <w:r>
+        <w:rPr>
+          <w:lang w:val="es-US"/>
+        </w:rPr>
+        <w:t>produccion</w:t>
+      </w:r>
+      <w:proofErr w:type="spellEnd"/>
+      <w:r>
+        <w:rPr>
+          <w:lang w:val="es-US"/>
+        </w:rPr>
+        <w:t>.</w:t>
       </w:r>
     </w:p>
     <w:p>
       <w:pPr>
         <w:spacing w:before="100" w:after="0"/>
+        <w:rPr>
+          <w:lang w:val="es-US"/>
+        </w:rPr>
       </w:pPr>
       <w:r>
         <w:rPr>
           <w:b/>
+          <w:lang w:val="es-US"/>
         </w:rPr>
         <w:t xml:space="preserve">Resultado visible: </w:t>
       </w:r>
@@ -218,28 +774,233 @@
           <w:rPr>
             <w:color w:val="2E74B5"/>
             <w:u w:val="single"/>
+            <w:lang w:val="es-US"/>
           </w:rPr>
           <w:t>lab3-sitelang-ian-cumes.vercel.app</w:t>
         </w:r>
       </w:hyperlink>
     </w:p>
     <w:p>
-      <w:r>
+      <w:pPr>
+        <w:rPr>
+          <w:lang w:val="es-US"/>
+        </w:rPr>
+      </w:pPr>
+      <w:r>
+        <w:rPr>
+          <w:lang w:val="es-US"/>
+        </w:rPr>
         <w:br w:type="page"/>
       </w:r>
     </w:p>
     <w:p>
       <w:pPr>
         <w:pStyle w:val="Heading1"/>
+        <w:rPr>
+          <w:lang w:val="es-US"/>
+        </w:rPr>
       </w:pPr>
       <w:r>
+        <w:rPr>
+          <w:lang w:val="es-US"/>
+        </w:rPr>
         <w:lastRenderedPageBreak/>
-        <w:t>3. Relacion con Vercel CLI</w:t>
+        <w:t xml:space="preserve">3. </w:t>
+      </w:r>
+      <w:proofErr w:type="spellStart"/>
+      <w:r>
+        <w:rPr>
+          <w:lang w:val="es-US"/>
+        </w:rPr>
+        <w:t>Relacion</w:t>
+      </w:r>
+      <w:proofErr w:type="spellEnd"/>
+      <w:r>
+        <w:rPr>
+          <w:lang w:val="es-US"/>
+        </w:rPr>
+        <w:t xml:space="preserve"> con </w:t>
+      </w:r>
+      <w:proofErr w:type="spellStart"/>
+      <w:r>
+        <w:rPr>
+          <w:lang w:val="es-US"/>
+        </w:rPr>
+        <w:t>Vercel</w:t>
+      </w:r>
+      <w:proofErr w:type="spellEnd"/>
+      <w:r>
+        <w:rPr>
+          <w:lang w:val="es-US"/>
+        </w:rPr>
+        <w:t xml:space="preserve"> CLI</w:t>
       </w:r>
     </w:p>
     <w:p>
-      <w:r>
-        <w:t>La semejanza principal no esta en la interfaz, sino en el pipeline. Vercel CLI lee la configuracion de un proyecto, decide que archivos forman el deployment y envia una solicitud autenticada al servicio. SiteLang hace una version reducida de ese trabajo: interpreta su propio formato, prepara un unico artefacto estatico y llama directamente al endpoint de deployments.</w:t>
+      <w:pPr>
+        <w:rPr>
+          <w:lang w:val="es-US"/>
+        </w:rPr>
+      </w:pPr>
+      <w:r>
+        <w:rPr>
+          <w:lang w:val="es-US"/>
+        </w:rPr>
+        <w:t xml:space="preserve">La semejanza principal no </w:t>
+      </w:r>
+      <w:proofErr w:type="spellStart"/>
+      <w:r>
+        <w:rPr>
+          <w:lang w:val="es-US"/>
+        </w:rPr>
+        <w:t>esta</w:t>
+      </w:r>
+      <w:proofErr w:type="spellEnd"/>
+      <w:r>
+        <w:rPr>
+          <w:lang w:val="es-US"/>
+        </w:rPr>
+        <w:t xml:space="preserve"> en la interfaz, sino en el pipeline. </w:t>
+      </w:r>
+      <w:proofErr w:type="spellStart"/>
+      <w:r>
+        <w:rPr>
+          <w:lang w:val="es-US"/>
+        </w:rPr>
+        <w:t>Vercel</w:t>
+      </w:r>
+      <w:proofErr w:type="spellEnd"/>
+      <w:r>
+        <w:rPr>
+          <w:lang w:val="es-US"/>
+        </w:rPr>
+        <w:t xml:space="preserve"> CLI lee la </w:t>
+      </w:r>
+      <w:proofErr w:type="spellStart"/>
+      <w:r>
+        <w:rPr>
+          <w:lang w:val="es-US"/>
+        </w:rPr>
+        <w:t>configuracion</w:t>
+      </w:r>
+      <w:proofErr w:type="spellEnd"/>
+      <w:r>
+        <w:rPr>
+          <w:lang w:val="es-US"/>
+        </w:rPr>
+        <w:t xml:space="preserve"> de un proyecto, decide que archivos forman el </w:t>
+      </w:r>
+      <w:proofErr w:type="spellStart"/>
+      <w:r>
+        <w:rPr>
+          <w:lang w:val="es-US"/>
+        </w:rPr>
+        <w:t>deployment</w:t>
+      </w:r>
+      <w:proofErr w:type="spellEnd"/>
+      <w:r>
+        <w:rPr>
+          <w:lang w:val="es-US"/>
+        </w:rPr>
+        <w:t xml:space="preserve"> y </w:t>
+      </w:r>
+      <w:proofErr w:type="spellStart"/>
+      <w:r>
+        <w:rPr>
+          <w:lang w:val="es-US"/>
+        </w:rPr>
+        <w:t>envia</w:t>
+      </w:r>
+      <w:proofErr w:type="spellEnd"/>
+      <w:r>
+        <w:rPr>
+          <w:lang w:val="es-US"/>
+        </w:rPr>
+        <w:t xml:space="preserve"> una solicitud autenticada al servicio. </w:t>
+      </w:r>
+      <w:proofErr w:type="spellStart"/>
+      <w:r>
+        <w:rPr>
+          <w:lang w:val="es-US"/>
+        </w:rPr>
+        <w:t>SiteLang</w:t>
+      </w:r>
+      <w:proofErr w:type="spellEnd"/>
+      <w:r>
+        <w:rPr>
+          <w:lang w:val="es-US"/>
+        </w:rPr>
+        <w:t xml:space="preserve"> hace una </w:t>
+      </w:r>
+      <w:proofErr w:type="spellStart"/>
+      <w:r>
+        <w:rPr>
+          <w:lang w:val="es-US"/>
+        </w:rPr>
+        <w:t>version</w:t>
+      </w:r>
+      <w:proofErr w:type="spellEnd"/>
+      <w:r>
+        <w:rPr>
+          <w:lang w:val="es-US"/>
+        </w:rPr>
+        <w:t xml:space="preserve"> reducida de ese trabajo: interpreta su propio formato, prepara un </w:t>
+      </w:r>
+      <w:proofErr w:type="spellStart"/>
+      <w:r>
+        <w:rPr>
+          <w:lang w:val="es-US"/>
+        </w:rPr>
+        <w:t>unico</w:t>
+      </w:r>
+      <w:proofErr w:type="spellEnd"/>
+      <w:r>
+        <w:rPr>
+          <w:lang w:val="es-US"/>
+        </w:rPr>
+        <w:t xml:space="preserve"> artefacto </w:t>
+      </w:r>
+      <w:proofErr w:type="spellStart"/>
+      <w:r>
+        <w:rPr>
+          <w:lang w:val="es-US"/>
+        </w:rPr>
+        <w:t>estatico</w:t>
+      </w:r>
+      <w:proofErr w:type="spellEnd"/>
+      <w:r>
+        <w:rPr>
+          <w:lang w:val="es-US"/>
+        </w:rPr>
+        <w:t xml:space="preserve"> y llama directamente al </w:t>
+      </w:r>
+      <w:proofErr w:type="spellStart"/>
+      <w:r>
+        <w:rPr>
+          <w:lang w:val="es-US"/>
+        </w:rPr>
+        <w:t>endpoint</w:t>
+      </w:r>
+      <w:proofErr w:type="spellEnd"/>
+      <w:r>
+        <w:rPr>
+          <w:lang w:val="es-US"/>
+        </w:rPr>
+        <w:t xml:space="preserve"> de </w:t>
+      </w:r>
+      <w:proofErr w:type="spellStart"/>
+      <w:r>
+        <w:rPr>
+          <w:lang w:val="es-US"/>
+        </w:rPr>
+        <w:t>deployments</w:t>
+      </w:r>
+      <w:proofErr w:type="spellEnd"/>
+      <w:r>
+        <w:rPr>
+          <w:lang w:val="es-US"/>
+        </w:rPr>
+        <w:t>.</w:t>
       </w:r>
     </w:p>
     <w:tbl>
@@ -276,8 +1037,33 @@
                 <w:b/>
                 <w:sz w:val="21"/>
               </w:rPr>
-              <w:t>Mi compilador SiteLang</w:t>
+              <w:t xml:space="preserve">Mi </w:t>
             </w:r>
+            <w:proofErr w:type="spellStart"/>
+            <w:r>
+              <w:rPr>
+                <w:b/>
+                <w:sz w:val="21"/>
+              </w:rPr>
+              <w:t>compilador</w:t>
+            </w:r>
+            <w:proofErr w:type="spellEnd"/>
+            <w:r>
+              <w:rPr>
+                <w:b/>
+                <w:sz w:val="21"/>
+              </w:rPr>
+              <w:t xml:space="preserve"> </w:t>
+            </w:r>
+            <w:proofErr w:type="spellStart"/>
+            <w:r>
+              <w:rPr>
+                <w:b/>
+                <w:sz w:val="21"/>
+              </w:rPr>
+              <w:t>SiteLang</w:t>
+            </w:r>
+            <w:proofErr w:type="spellEnd"/>
           </w:p>
         </w:tc>
         <w:tc>
@@ -296,12 +1082,344 @@
             <w:pPr>
               <w:spacing w:after="0"/>
             </w:pPr>
+            <w:proofErr w:type="spellStart"/>
             <w:r>
               <w:rPr>
                 <w:b/>
                 <w:sz w:val="21"/>
               </w:rPr>
-              <w:t>Vercel CLI</w:t>
+              <w:t>Vercel</w:t>
+            </w:r>
+            <w:proofErr w:type="spellEnd"/>
+            <w:r>
+              <w:rPr>
+                <w:b/>
+                <w:sz w:val="21"/>
+              </w:rPr>
+              <w:t xml:space="preserve"> CLI</w:t>
+            </w:r>
+          </w:p>
+        </w:tc>
+      </w:tr>
+      <w:tr>
+        <w:tc>
+          <w:tcPr>
+            <w:tcW w:w="4680" w:type="dxa"/>
+            <w:tcMar>
+              <w:top w:w="100" w:type="dxa"/>
+              <w:left w:w="120" w:type="dxa"/>
+              <w:bottom w:w="100" w:type="dxa"/>
+              <w:right w:w="120" w:type="dxa"/>
+            </w:tcMar>
+            <w:vAlign w:val="center"/>
+          </w:tcPr>
+          <w:p>
+            <w:pPr>
+              <w:spacing w:after="0" w:line="252" w:lineRule="auto"/>
+              <w:rPr>
+                <w:lang w:val="es-US"/>
+              </w:rPr>
+            </w:pPr>
+            <w:proofErr w:type="spellStart"/>
+            <w:r>
+              <w:rPr>
+                <w:sz w:val="19"/>
+                <w:lang w:val="es-US"/>
+              </w:rPr>
+              <w:t>Parsea</w:t>
+            </w:r>
+            <w:proofErr w:type="spellEnd"/>
+            <w:r>
+              <w:rPr>
+                <w:sz w:val="19"/>
+                <w:lang w:val="es-US"/>
+              </w:rPr>
+              <w:t xml:space="preserve"> site.sl con una </w:t>
+            </w:r>
+            <w:proofErr w:type="spellStart"/>
+            <w:r>
+              <w:rPr>
+                <w:sz w:val="19"/>
+                <w:lang w:val="es-US"/>
+              </w:rPr>
+              <w:t>gramatica</w:t>
+            </w:r>
+            <w:proofErr w:type="spellEnd"/>
+            <w:r>
+              <w:rPr>
+                <w:sz w:val="19"/>
+                <w:lang w:val="es-US"/>
+              </w:rPr>
+              <w:t xml:space="preserve"> ANTLR.</w:t>
+            </w:r>
+          </w:p>
+        </w:tc>
+        <w:tc>
+          <w:tcPr>
+            <w:tcW w:w="4680" w:type="dxa"/>
+            <w:tcMar>
+              <w:top w:w="100" w:type="dxa"/>
+              <w:left w:w="120" w:type="dxa"/>
+              <w:bottom w:w="100" w:type="dxa"/>
+              <w:right w:w="120" w:type="dxa"/>
+            </w:tcMar>
+            <w:vAlign w:val="center"/>
+          </w:tcPr>
+          <w:p>
+            <w:pPr>
+              <w:spacing w:after="0" w:line="252" w:lineRule="auto"/>
+              <w:rPr>
+                <w:lang w:val="es-US"/>
+              </w:rPr>
+            </w:pPr>
+            <w:r>
+              <w:rPr>
+                <w:sz w:val="19"/>
+                <w:lang w:val="es-US"/>
+              </w:rPr>
+              <w:t xml:space="preserve">Lee opciones, </w:t>
+            </w:r>
+            <w:proofErr w:type="spellStart"/>
+            <w:proofErr w:type="gramStart"/>
+            <w:r>
+              <w:rPr>
+                <w:sz w:val="19"/>
+                <w:lang w:val="es-US"/>
+              </w:rPr>
+              <w:t>vercel.json</w:t>
+            </w:r>
+            <w:proofErr w:type="spellEnd"/>
+            <w:proofErr w:type="gramEnd"/>
+            <w:r>
+              <w:rPr>
+                <w:sz w:val="19"/>
+                <w:lang w:val="es-US"/>
+              </w:rPr>
+              <w:t xml:space="preserve"> y </w:t>
+            </w:r>
+            <w:proofErr w:type="spellStart"/>
+            <w:r>
+              <w:rPr>
+                <w:sz w:val="19"/>
+                <w:lang w:val="es-US"/>
+              </w:rPr>
+              <w:t>configuracion</w:t>
+            </w:r>
+            <w:proofErr w:type="spellEnd"/>
+            <w:r>
+              <w:rPr>
+                <w:sz w:val="19"/>
+                <w:lang w:val="es-US"/>
+              </w:rPr>
+              <w:t xml:space="preserve"> del proyecto.</w:t>
+            </w:r>
+          </w:p>
+        </w:tc>
+      </w:tr>
+      <w:tr>
+        <w:tc>
+          <w:tcPr>
+            <w:tcW w:w="4680" w:type="dxa"/>
+            <w:tcMar>
+              <w:top w:w="100" w:type="dxa"/>
+              <w:left w:w="120" w:type="dxa"/>
+              <w:bottom w:w="100" w:type="dxa"/>
+              <w:right w:w="120" w:type="dxa"/>
+            </w:tcMar>
+            <w:vAlign w:val="center"/>
+          </w:tcPr>
+          <w:p>
+            <w:pPr>
+              <w:spacing w:after="0" w:line="252" w:lineRule="auto"/>
+              <w:rPr>
+                <w:lang w:val="es-US"/>
+              </w:rPr>
+            </w:pPr>
+            <w:r>
+              <w:rPr>
+                <w:sz w:val="19"/>
+                <w:lang w:val="es-US"/>
+              </w:rPr>
+              <w:t xml:space="preserve">El </w:t>
+            </w:r>
+            <w:proofErr w:type="spellStart"/>
+            <w:r>
+              <w:rPr>
+                <w:sz w:val="19"/>
+                <w:lang w:val="es-US"/>
+              </w:rPr>
+              <w:t>Listener</w:t>
+            </w:r>
+            <w:proofErr w:type="spellEnd"/>
+            <w:r>
+              <w:rPr>
+                <w:sz w:val="19"/>
+                <w:lang w:val="es-US"/>
+              </w:rPr>
+              <w:t xml:space="preserve"> construye y valida un modelo pequeño.</w:t>
+            </w:r>
+          </w:p>
+        </w:tc>
+        <w:tc>
+          <w:tcPr>
+            <w:tcW w:w="4680" w:type="dxa"/>
+            <w:tcMar>
+              <w:top w:w="100" w:type="dxa"/>
+              <w:left w:w="120" w:type="dxa"/>
+              <w:bottom w:w="100" w:type="dxa"/>
+              <w:right w:w="120" w:type="dxa"/>
+            </w:tcMar>
+            <w:vAlign w:val="center"/>
+          </w:tcPr>
+          <w:p>
+            <w:pPr>
+              <w:spacing w:after="0" w:line="252" w:lineRule="auto"/>
+              <w:rPr>
+                <w:lang w:val="es-US"/>
+              </w:rPr>
+            </w:pPr>
+            <w:r>
+              <w:rPr>
+                <w:sz w:val="19"/>
+                <w:lang w:val="es-US"/>
+              </w:rPr>
+              <w:t xml:space="preserve">Resuelve </w:t>
+            </w:r>
+            <w:proofErr w:type="spellStart"/>
+            <w:r>
+              <w:rPr>
+                <w:sz w:val="19"/>
+                <w:lang w:val="es-US"/>
+              </w:rPr>
+              <w:t>framework</w:t>
+            </w:r>
+            <w:proofErr w:type="spellEnd"/>
+            <w:r>
+              <w:rPr>
+                <w:sz w:val="19"/>
+                <w:lang w:val="es-US"/>
+              </w:rPr>
+              <w:t xml:space="preserve">, rutas, archivos y opciones de </w:t>
+            </w:r>
+            <w:proofErr w:type="spellStart"/>
+            <w:r>
+              <w:rPr>
+                <w:sz w:val="19"/>
+                <w:lang w:val="es-US"/>
+              </w:rPr>
+              <w:t>build</w:t>
+            </w:r>
+            <w:proofErr w:type="spellEnd"/>
+            <w:r>
+              <w:rPr>
+                <w:sz w:val="19"/>
+                <w:lang w:val="es-US"/>
+              </w:rPr>
+              <w:t>.</w:t>
+            </w:r>
+          </w:p>
+        </w:tc>
+      </w:tr>
+      <w:tr>
+        <w:tc>
+          <w:tcPr>
+            <w:tcW w:w="4680" w:type="dxa"/>
+            <w:tcMar>
+              <w:top w:w="100" w:type="dxa"/>
+              <w:left w:w="120" w:type="dxa"/>
+              <w:bottom w:w="100" w:type="dxa"/>
+              <w:right w:w="120" w:type="dxa"/>
+            </w:tcMar>
+            <w:vAlign w:val="center"/>
+          </w:tcPr>
+          <w:p>
+            <w:pPr>
+              <w:spacing w:after="0" w:line="252" w:lineRule="auto"/>
+              <w:rPr>
+                <w:lang w:val="es-US"/>
+              </w:rPr>
+            </w:pPr>
+            <w:r>
+              <w:rPr>
+                <w:sz w:val="19"/>
+                <w:lang w:val="es-US"/>
+              </w:rPr>
+              <w:t xml:space="preserve">Genera un solo index.html </w:t>
+            </w:r>
+            <w:proofErr w:type="spellStart"/>
+            <w:r>
+              <w:rPr>
+                <w:sz w:val="19"/>
+                <w:lang w:val="es-US"/>
+              </w:rPr>
+              <w:t>estatico</w:t>
+            </w:r>
+            <w:proofErr w:type="spellEnd"/>
+            <w:r>
+              <w:rPr>
+                <w:sz w:val="19"/>
+                <w:lang w:val="es-US"/>
+              </w:rPr>
+              <w:t>.</w:t>
+            </w:r>
+          </w:p>
+        </w:tc>
+        <w:tc>
+          <w:tcPr>
+            <w:tcW w:w="4680" w:type="dxa"/>
+            <w:tcMar>
+              <w:top w:w="100" w:type="dxa"/>
+              <w:left w:w="120" w:type="dxa"/>
+              <w:bottom w:w="100" w:type="dxa"/>
+              <w:right w:w="120" w:type="dxa"/>
+            </w:tcMar>
+            <w:vAlign w:val="center"/>
+          </w:tcPr>
+          <w:p>
+            <w:pPr>
+              <w:spacing w:after="0" w:line="252" w:lineRule="auto"/>
+              <w:rPr>
+                <w:lang w:val="es-US"/>
+              </w:rPr>
+            </w:pPr>
+            <w:r>
+              <w:rPr>
+                <w:sz w:val="19"/>
+                <w:lang w:val="es-US"/>
+              </w:rPr>
+              <w:t xml:space="preserve">Prepara uno o varios artefactos </w:t>
+            </w:r>
+            <w:proofErr w:type="spellStart"/>
+            <w:r>
+              <w:rPr>
+                <w:sz w:val="19"/>
+                <w:lang w:val="es-US"/>
+              </w:rPr>
+              <w:t>segun</w:t>
+            </w:r>
+            <w:proofErr w:type="spellEnd"/>
+            <w:r>
+              <w:rPr>
+                <w:sz w:val="19"/>
+                <w:lang w:val="es-US"/>
+              </w:rPr>
+              <w:t xml:space="preserve"> el </w:t>
+            </w:r>
+            <w:proofErr w:type="spellStart"/>
+            <w:r>
+              <w:rPr>
+                <w:sz w:val="19"/>
+                <w:lang w:val="es-US"/>
+              </w:rPr>
+              <w:t>framework</w:t>
+            </w:r>
+            <w:proofErr w:type="spellEnd"/>
+            <w:r>
+              <w:rPr>
+                <w:sz w:val="19"/>
+                <w:lang w:val="es-US"/>
+              </w:rPr>
+              <w:t>.</w:t>
             </w:r>
           </w:p>
         </w:tc>
@@ -326,7 +1444,21 @@
               <w:rPr>
                 <w:sz w:val="19"/>
               </w:rPr>
-              <w:t>Parsea site.sl con una gramatica ANTLR.</w:t>
+              <w:t xml:space="preserve">Llama POST /v13/deployments y </w:t>
+            </w:r>
+            <w:proofErr w:type="spellStart"/>
+            <w:r>
+              <w:rPr>
+                <w:sz w:val="19"/>
+              </w:rPr>
+              <w:t>espera</w:t>
+            </w:r>
+            <w:proofErr w:type="spellEnd"/>
+            <w:r>
+              <w:rPr>
+                <w:sz w:val="19"/>
+              </w:rPr>
+              <w:t xml:space="preserve"> READY.</w:t>
             </w:r>
           </w:p>
         </w:tc>
@@ -344,156 +1476,32 @@
           <w:p>
             <w:pPr>
               <w:spacing w:after="0" w:line="252" w:lineRule="auto"/>
+              <w:rPr>
+                <w:lang w:val="es-US"/>
+              </w:rPr>
             </w:pPr>
             <w:r>
               <w:rPr>
                 <w:sz w:val="19"/>
+                <w:lang w:val="es-US"/>
               </w:rPr>
-              <w:t>Lee opciones, vercel.json y configuracion del proyecto.</w:t>
+              <w:t xml:space="preserve">Usa la plataforma de </w:t>
             </w:r>
-          </w:p>
-        </w:tc>
-      </w:tr>
-      <w:tr>
-        <w:tc>
-          <w:tcPr>
-            <w:tcW w:w="4680" w:type="dxa"/>
-            <w:tcMar>
-              <w:top w:w="100" w:type="dxa"/>
-              <w:left w:w="120" w:type="dxa"/>
-              <w:bottom w:w="100" w:type="dxa"/>
-              <w:right w:w="120" w:type="dxa"/>
-            </w:tcMar>
-            <w:vAlign w:val="center"/>
-          </w:tcPr>
-          <w:p>
-            <w:pPr>
-              <w:spacing w:after="0" w:line="252" w:lineRule="auto"/>
-            </w:pPr>
+            <w:proofErr w:type="spellStart"/>
             <w:r>
               <w:rPr>
                 <w:sz w:val="19"/>
+                <w:lang w:val="es-US"/>
               </w:rPr>
-              <w:t>El Listener construye y valida un modelo pequeño.</w:t>
+              <w:t>Vercel</w:t>
             </w:r>
-          </w:p>
-        </w:tc>
-        <w:tc>
-          <w:tcPr>
-            <w:tcW w:w="4680" w:type="dxa"/>
-            <w:tcMar>
-              <w:top w:w="100" w:type="dxa"/>
-              <w:left w:w="120" w:type="dxa"/>
-              <w:bottom w:w="100" w:type="dxa"/>
-              <w:right w:w="120" w:type="dxa"/>
-            </w:tcMar>
-            <w:vAlign w:val="center"/>
-          </w:tcPr>
-          <w:p>
-            <w:pPr>
-              <w:spacing w:after="0" w:line="252" w:lineRule="auto"/>
-            </w:pPr>
+            <w:proofErr w:type="spellEnd"/>
             <w:r>
               <w:rPr>
                 <w:sz w:val="19"/>
+                <w:lang w:val="es-US"/>
               </w:rPr>
-              <w:t>Resuelve framework, rutas, archivos y opciones de build.</w:t>
-            </w:r>
-          </w:p>
-        </w:tc>
-      </w:tr>
-      <w:tr>
-        <w:tc>
-          <w:tcPr>
-            <w:tcW w:w="4680" w:type="dxa"/>
-            <w:tcMar>
-              <w:top w:w="100" w:type="dxa"/>
-              <w:left w:w="120" w:type="dxa"/>
-              <w:bottom w:w="100" w:type="dxa"/>
-              <w:right w:w="120" w:type="dxa"/>
-            </w:tcMar>
-            <w:vAlign w:val="center"/>
-          </w:tcPr>
-          <w:p>
-            <w:pPr>
-              <w:spacing w:after="0" w:line="252" w:lineRule="auto"/>
-            </w:pPr>
-            <w:r>
-              <w:rPr>
-                <w:sz w:val="19"/>
-              </w:rPr>
-              <w:t>Genera un solo index.html estatico.</w:t>
-            </w:r>
-          </w:p>
-        </w:tc>
-        <w:tc>
-          <w:tcPr>
-            <w:tcW w:w="4680" w:type="dxa"/>
-            <w:tcMar>
-              <w:top w:w="100" w:type="dxa"/>
-              <w:left w:w="120" w:type="dxa"/>
-              <w:bottom w:w="100" w:type="dxa"/>
-              <w:right w:w="120" w:type="dxa"/>
-            </w:tcMar>
-            <w:vAlign w:val="center"/>
-          </w:tcPr>
-          <w:p>
-            <w:pPr>
-              <w:spacing w:after="0" w:line="252" w:lineRule="auto"/>
-            </w:pPr>
-            <w:r>
-              <w:rPr>
-                <w:sz w:val="19"/>
-              </w:rPr>
-              <w:t>Prepara uno o varios artefactos segun el framework.</w:t>
-            </w:r>
-          </w:p>
-        </w:tc>
-      </w:tr>
-      <w:tr>
-        <w:tc>
-          <w:tcPr>
-            <w:tcW w:w="4680" w:type="dxa"/>
-            <w:tcMar>
-              <w:top w:w="100" w:type="dxa"/>
-              <w:left w:w="120" w:type="dxa"/>
-              <w:bottom w:w="100" w:type="dxa"/>
-              <w:right w:w="120" w:type="dxa"/>
-            </w:tcMar>
-            <w:vAlign w:val="center"/>
-          </w:tcPr>
-          <w:p>
-            <w:pPr>
-              <w:spacing w:after="0" w:line="252" w:lineRule="auto"/>
-            </w:pPr>
-            <w:r>
-              <w:rPr>
-                <w:sz w:val="19"/>
-              </w:rPr>
-              <w:t>Llama POST /v13/deployments y espera READY.</w:t>
-            </w:r>
-          </w:p>
-        </w:tc>
-        <w:tc>
-          <w:tcPr>
-            <w:tcW w:w="4680" w:type="dxa"/>
-            <w:tcMar>
-              <w:top w:w="100" w:type="dxa"/>
-              <w:left w:w="120" w:type="dxa"/>
-              <w:bottom w:w="100" w:type="dxa"/>
-              <w:right w:w="120" w:type="dxa"/>
-            </w:tcMar>
-            <w:vAlign w:val="center"/>
-          </w:tcPr>
-          <w:p>
-            <w:pPr>
-              <w:spacing w:after="0" w:line="252" w:lineRule="auto"/>
-            </w:pPr>
-            <w:r>
-              <w:rPr>
-                <w:sz w:val="19"/>
-              </w:rPr>
-              <w:t>Usa la plataforma de Vercel y presenta el resultado al usuario.</w:t>
+              <w:t xml:space="preserve"> y presenta el resultado al usuario.</w:t>
             </w:r>
           </w:p>
         </w:tc>
@@ -502,58 +1510,375 @@
     <w:p>
       <w:pPr>
         <w:pStyle w:val="Heading1"/>
+        <w:rPr>
+          <w:lang w:val="es-US"/>
+        </w:rPr>
       </w:pPr>
       <w:r>
+        <w:rPr>
+          <w:lang w:val="es-US"/>
+        </w:rPr>
         <w:t>4. Resultados y limites</w:t>
       </w:r>
     </w:p>
     <w:p>
-      <w:r>
-        <w:t>La ejecucion final produjo dos evidencias independientes: el HTML quedo versionado en GitHub con un commit de iancumes y Vercel asigno una URL estable de produccion. Ademas, repeti el flujo sin crear recursos duplicados; el compilador detecto el repositorio existente y actualizo el archivo usando su SHA.</w:t>
+      <w:pPr>
+        <w:rPr>
+          <w:lang w:val="es-US"/>
+        </w:rPr>
+      </w:pPr>
+      <w:r>
+        <w:rPr>
+          <w:lang w:val="es-US"/>
+        </w:rPr>
+        <w:t xml:space="preserve">La </w:t>
+      </w:r>
+      <w:proofErr w:type="spellStart"/>
+      <w:r>
+        <w:rPr>
+          <w:lang w:val="es-US"/>
+        </w:rPr>
+        <w:t>ejecucion</w:t>
+      </w:r>
+      <w:proofErr w:type="spellEnd"/>
+      <w:r>
+        <w:rPr>
+          <w:lang w:val="es-US"/>
+        </w:rPr>
+        <w:t xml:space="preserve"> final produjo dos evidencias independientes: el HTML quedo versionado en GitHub con un </w:t>
+      </w:r>
+      <w:proofErr w:type="spellStart"/>
+      <w:r>
+        <w:rPr>
+          <w:lang w:val="es-US"/>
+        </w:rPr>
+        <w:t>commit</w:t>
+      </w:r>
+      <w:proofErr w:type="spellEnd"/>
+      <w:r>
+        <w:rPr>
+          <w:lang w:val="es-US"/>
+        </w:rPr>
+        <w:t xml:space="preserve"> de </w:t>
+      </w:r>
+      <w:proofErr w:type="spellStart"/>
+      <w:r>
+        <w:rPr>
+          <w:lang w:val="es-US"/>
+        </w:rPr>
+        <w:t>iancumes</w:t>
+      </w:r>
+      <w:proofErr w:type="spellEnd"/>
+      <w:r>
+        <w:rPr>
+          <w:lang w:val="es-US"/>
+        </w:rPr>
+        <w:t xml:space="preserve"> y </w:t>
+      </w:r>
+      <w:proofErr w:type="spellStart"/>
+      <w:r>
+        <w:rPr>
+          <w:lang w:val="es-US"/>
+        </w:rPr>
+        <w:t>Vercel</w:t>
+      </w:r>
+      <w:proofErr w:type="spellEnd"/>
+      <w:r>
+        <w:rPr>
+          <w:lang w:val="es-US"/>
+        </w:rPr>
+        <w:t xml:space="preserve"> asigno una URL estable de </w:t>
+      </w:r>
+      <w:proofErr w:type="spellStart"/>
+      <w:r>
+        <w:rPr>
+          <w:lang w:val="es-US"/>
+        </w:rPr>
+        <w:t>produccion</w:t>
+      </w:r>
+      <w:proofErr w:type="spellEnd"/>
+      <w:r>
+        <w:rPr>
+          <w:lang w:val="es-US"/>
+        </w:rPr>
+        <w:t xml:space="preserve">. </w:t>
+      </w:r>
+      <w:proofErr w:type="spellStart"/>
+      <w:r>
+        <w:rPr>
+          <w:lang w:val="es-US"/>
+        </w:rPr>
+        <w:t>Ademas</w:t>
+      </w:r>
+      <w:proofErr w:type="spellEnd"/>
+      <w:r>
+        <w:rPr>
+          <w:lang w:val="es-US"/>
+        </w:rPr>
+        <w:t xml:space="preserve">, </w:t>
+      </w:r>
+      <w:proofErr w:type="spellStart"/>
+      <w:r>
+        <w:rPr>
+          <w:lang w:val="es-US"/>
+        </w:rPr>
+        <w:t>repeti</w:t>
+      </w:r>
+      <w:proofErr w:type="spellEnd"/>
+      <w:r>
+        <w:rPr>
+          <w:lang w:val="es-US"/>
+        </w:rPr>
+        <w:t xml:space="preserve"> el flujo sin crear recursos duplicados; el compilador detecto el repositorio existente y actualizo el archivo usando su SHA.</w:t>
       </w:r>
     </w:p>
     <w:p>
-      <w:r>
-        <w:t>El alcance es deliberadamente menor que el de una herramienta real. SiteLang genera una pagina estatica, admite un conjunto cerrado de atributos y no ejecuta builds de frameworks. Esa limitacion permite ver con claridad las etapas relevantes para el curso: lexer, parser, recorrido del arbol, validacion, generacion y efectos externos.</w:t>
+      <w:pPr>
+        <w:rPr>
+          <w:lang w:val="es-US"/>
+        </w:rPr>
+      </w:pPr>
+      <w:r>
+        <w:rPr>
+          <w:lang w:val="es-US"/>
+        </w:rPr>
+        <w:t xml:space="preserve">El alcance es deliberadamente menor que el de una herramienta real. </w:t>
+      </w:r>
+      <w:proofErr w:type="spellStart"/>
+      <w:r>
+        <w:rPr>
+          <w:lang w:val="es-US"/>
+        </w:rPr>
+        <w:t>SiteLang</w:t>
+      </w:r>
+      <w:proofErr w:type="spellEnd"/>
+      <w:r>
+        <w:rPr>
+          <w:lang w:val="es-US"/>
+        </w:rPr>
+        <w:t xml:space="preserve"> genera una </w:t>
+      </w:r>
+      <w:proofErr w:type="spellStart"/>
+      <w:r>
+        <w:rPr>
+          <w:lang w:val="es-US"/>
+        </w:rPr>
+        <w:t>pagina</w:t>
+      </w:r>
+      <w:proofErr w:type="spellEnd"/>
+      <w:r>
+        <w:rPr>
+          <w:lang w:val="es-US"/>
+        </w:rPr>
+        <w:t xml:space="preserve"> </w:t>
+      </w:r>
+      <w:proofErr w:type="spellStart"/>
+      <w:r>
+        <w:rPr>
+          <w:lang w:val="es-US"/>
+        </w:rPr>
+        <w:t>estatica</w:t>
+      </w:r>
+      <w:proofErr w:type="spellEnd"/>
+      <w:r>
+        <w:rPr>
+          <w:lang w:val="es-US"/>
+        </w:rPr>
+        <w:t xml:space="preserve">, admite un conjunto cerrado de atributos y no ejecuta </w:t>
+      </w:r>
+      <w:proofErr w:type="spellStart"/>
+      <w:r>
+        <w:rPr>
+          <w:lang w:val="es-US"/>
+        </w:rPr>
+        <w:t>builds</w:t>
+      </w:r>
+      <w:proofErr w:type="spellEnd"/>
+      <w:r>
+        <w:rPr>
+          <w:lang w:val="es-US"/>
+        </w:rPr>
+        <w:t xml:space="preserve"> de </w:t>
+      </w:r>
+      <w:proofErr w:type="spellStart"/>
+      <w:r>
+        <w:rPr>
+          <w:lang w:val="es-US"/>
+        </w:rPr>
+        <w:t>frameworks</w:t>
+      </w:r>
+      <w:proofErr w:type="spellEnd"/>
+      <w:r>
+        <w:rPr>
+          <w:lang w:val="es-US"/>
+        </w:rPr>
+        <w:t xml:space="preserve">. Esa </w:t>
+      </w:r>
+      <w:proofErr w:type="spellStart"/>
+      <w:r>
+        <w:rPr>
+          <w:lang w:val="es-US"/>
+        </w:rPr>
+        <w:t>limitacion</w:t>
+      </w:r>
+      <w:proofErr w:type="spellEnd"/>
+      <w:r>
+        <w:rPr>
+          <w:lang w:val="es-US"/>
+        </w:rPr>
+        <w:t xml:space="preserve"> permite ver con claridad las etapas relevantes para el curso: </w:t>
+      </w:r>
+      <w:proofErr w:type="spellStart"/>
+      <w:r>
+        <w:rPr>
+          <w:lang w:val="es-US"/>
+        </w:rPr>
+        <w:t>lexer</w:t>
+      </w:r>
+      <w:proofErr w:type="spellEnd"/>
+      <w:r>
+        <w:rPr>
+          <w:lang w:val="es-US"/>
+        </w:rPr>
+        <w:t xml:space="preserve">, </w:t>
+      </w:r>
+      <w:proofErr w:type="spellStart"/>
+      <w:r>
+        <w:rPr>
+          <w:lang w:val="es-US"/>
+        </w:rPr>
+        <w:t>parser</w:t>
+      </w:r>
+      <w:proofErr w:type="spellEnd"/>
+      <w:r>
+        <w:rPr>
+          <w:lang w:val="es-US"/>
+        </w:rPr>
+        <w:t xml:space="preserve">, recorrido del </w:t>
+      </w:r>
+      <w:proofErr w:type="spellStart"/>
+      <w:r>
+        <w:rPr>
+          <w:lang w:val="es-US"/>
+        </w:rPr>
+        <w:t>arbol</w:t>
+      </w:r>
+      <w:proofErr w:type="spellEnd"/>
+      <w:r>
+        <w:rPr>
+          <w:lang w:val="es-US"/>
+        </w:rPr>
+        <w:t xml:space="preserve">, </w:t>
+      </w:r>
+      <w:proofErr w:type="spellStart"/>
+      <w:r>
+        <w:rPr>
+          <w:lang w:val="es-US"/>
+        </w:rPr>
+        <w:t>validacion</w:t>
+      </w:r>
+      <w:proofErr w:type="spellEnd"/>
+      <w:r>
+        <w:rPr>
+          <w:lang w:val="es-US"/>
+        </w:rPr>
+        <w:t xml:space="preserve">, </w:t>
+      </w:r>
+      <w:proofErr w:type="spellStart"/>
+      <w:r>
+        <w:rPr>
+          <w:lang w:val="es-US"/>
+        </w:rPr>
+        <w:t>generacion</w:t>
+      </w:r>
+      <w:proofErr w:type="spellEnd"/>
+      <w:r>
+        <w:rPr>
+          <w:lang w:val="es-US"/>
+        </w:rPr>
+        <w:t xml:space="preserve"> y efectos externos.</w:t>
       </w:r>
     </w:p>
     <w:p>
       <w:pPr>
         <w:pStyle w:val="Heading1"/>
+        <w:rPr>
+          <w:lang w:val="es-US"/>
+        </w:rPr>
       </w:pPr>
       <w:r>
+        <w:rPr>
+          <w:lang w:val="es-US"/>
+        </w:rPr>
         <w:t>5. Enlaces de la entrega</w:t>
       </w:r>
     </w:p>
     <w:p>
       <w:pPr>
         <w:spacing w:after="60"/>
+        <w:rPr>
+          <w:lang w:val="es-US"/>
+        </w:rPr>
       </w:pPr>
+      <w:proofErr w:type="spellStart"/>
       <w:r>
         <w:rPr>
           <w:b/>
           <w:sz w:val="21"/>
-        </w:rPr>
-        <w:t xml:space="preserve">Codigo fuente: </w:t>
+          <w:lang w:val="es-US"/>
+        </w:rPr>
+        <w:t>Codigo</w:t>
+      </w:r>
+      <w:proofErr w:type="spellEnd"/>
+      <w:r>
+        <w:rPr>
+          <w:b/>
+          <w:sz w:val="21"/>
+          <w:lang w:val="es-US"/>
+        </w:rPr>
+        <w:t xml:space="preserve"> fuente: </w:t>
       </w:r>
       <w:hyperlink r:id="rId9">
         <w:r>
           <w:rPr>
             <w:color w:val="2E74B5"/>
             <w:u w:val="single"/>
+            <w:lang w:val="es-US"/>
           </w:rPr>
-          <w:t>github.com/iancumes/compilers-2026</w:t>
+          <w:t>github.com/</w:t>
+        </w:r>
+        <w:proofErr w:type="spellStart"/>
+        <w:r>
+          <w:rPr>
+            <w:color w:val="2E74B5"/>
+            <w:u w:val="single"/>
+            <w:lang w:val="es-US"/>
+          </w:rPr>
+          <w:t>iancumes</w:t>
+        </w:r>
+        <w:proofErr w:type="spellEnd"/>
+        <w:r>
+          <w:rPr>
+            <w:color w:val="2E74B5"/>
+            <w:u w:val="single"/>
+            <w:lang w:val="es-US"/>
+          </w:rPr>
+          <w:t>/compilers-2026</w:t>
         </w:r>
       </w:hyperlink>
     </w:p>
     <w:p>
       <w:pPr>
         <w:spacing w:after="60"/>
+        <w:rPr>
+          <w:lang w:val="es-US"/>
+        </w:rPr>
       </w:pPr>
       <w:r>
         <w:rPr>
           <w:b/>
           <w:sz w:val="21"/>
+          <w:lang w:val="es-US"/>
         </w:rPr>
         <w:t xml:space="preserve">Repositorio generado: </w:t>
       </w:r>
@@ -562,19 +1887,42 @@
           <w:rPr>
             <w:color w:val="2E74B5"/>
             <w:u w:val="single"/>
+            <w:lang w:val="es-US"/>
           </w:rPr>
-          <w:t>github.com/iancumes/lab3-sitelang-ian-cumes</w:t>
+          <w:t>github.com/</w:t>
+        </w:r>
+        <w:proofErr w:type="spellStart"/>
+        <w:r>
+          <w:rPr>
+            <w:color w:val="2E74B5"/>
+            <w:u w:val="single"/>
+            <w:lang w:val="es-US"/>
+          </w:rPr>
+          <w:t>iancumes</w:t>
+        </w:r>
+        <w:proofErr w:type="spellEnd"/>
+        <w:r>
+          <w:rPr>
+            <w:color w:val="2E74B5"/>
+            <w:u w:val="single"/>
+            <w:lang w:val="es-US"/>
+          </w:rPr>
+          <w:t>/lab3-sitelang-ian-cumes</w:t>
         </w:r>
       </w:hyperlink>
     </w:p>
     <w:p>
       <w:pPr>
         <w:spacing w:after="60"/>
+        <w:rPr>
+          <w:lang w:val="es-US"/>
+        </w:rPr>
       </w:pPr>
       <w:r>
         <w:rPr>
           <w:b/>
           <w:sz w:val="21"/>
+          <w:lang w:val="es-US"/>
         </w:rPr>
         <w:t xml:space="preserve">Sitio publicado: </w:t>
       </w:r>
@@ -583,18 +1931,15 @@
           <w:rPr>
             <w:color w:val="2E74B5"/>
             <w:u w:val="single"/>
+            <w:lang w:val="es-US"/>
           </w:rPr>
           <w:t>lab3-sitelang-ian-cumes.vercel.app</w:t>
         </w:r>
       </w:hyperlink>
     </w:p>
     <w:sectPr>
-      <w:headerReference w:type="even" r:id="rId12"/>
-      <w:headerReference w:type="default" r:id="rId13"/>
-      <w:footerReference w:type="even" r:id="rId14"/>
-      <w:footerReference w:type="default" r:id="rId15"/>
-      <w:headerReference w:type="first" r:id="rId16"/>
-      <w:footerReference w:type="first" r:id="rId17"/>
+      <w:headerReference w:type="default" r:id="rId12"/>
+      <w:footerReference w:type="default" r:id="rId13"/>
       <w:pgSz w:w="12240" w:h="15840"/>
       <w:pgMar w:top="1440" w:right="1440" w:bottom="1440" w:left="1440" w:header="708" w:footer="708" w:gutter="0"/>
       <w:cols w:space="720"/>
@@ -634,71 +1979,7 @@
   <w:p>
     <w:pPr>
       <w:pStyle w:val="Footer"/>
-    </w:pPr>
-  </w:p>
-</w:ftr>
-</file>
-
-<file path=word/footer2.xml><?xml version="1.0" encoding="utf-8"?>
-<w:ftr xmlns:wpc="http://schemas.microsoft.com/office/word/2010/wordprocessingCanvas" xmlns:cx="http://schemas.microsoft.com/office/drawing/2014/chartex" xmlns:cx1="http://schemas.microsoft.com/office/drawing/2015/9/8/chartex" xmlns:cx2="http://schemas.microsoft.com/office/drawing/2015/10/21/chartex" xmlns:cx3="http://schemas.microsoft.com/office/drawing/2016/5/9/chartex" xmlns:cx4="http://schemas.microsoft.com/office/drawing/2016/5/10/chartex" xmlns:cx5="http://schemas.microsoft.com/office/drawing/2016/5/11/chartex" xmlns:cx6="http://schemas.microsoft.com/office/drawing/2016/5/12/chartex" xmlns:cx7="http://schemas.microsoft.com/office/drawing/2016/5/13/chartex" xmlns:cx8="http://schemas.microsoft.com/office/drawing/2016/5/14/chartex" xmlns:mc="http://schemas.openxmlformats.org/markup-compatibility/2006" xmlns:aink="http://schemas.microsoft.com/office/drawing/2016/ink" xmlns:am3d="http://schemas.microsoft.com/office/drawing/2017/model3d" xmlns:o="urn:schemas-microsoft-com:office:office" xmlns:oel="http://schemas.microsoft.com/office/2019/extlst" xmlns:r="http://schemas.openxmlformats.org/officeDocument/2006/relationships" xmlns:m="http://schemas.openxmlformats.org/officeDocument/2006/math" xmlns:v="urn:schemas-microsoft-com:vml" xmlns:wp14="http://schemas.microsoft.com/office/word/2010/wordprocessingDrawing" xmlns:wp="http://schemas.openxmlformats.org/drawingml/2006/wordprocessingDrawing" xmlns:w10="urn:schemas-microsoft-com:office:word" xmlns:w="http://schemas.openxmlformats.org/wordprocessingml/2006/main" xmlns:w14="http://schemas.microsoft.com/office/word/2010/wordml" xmlns:w15="http://schemas.microsoft.com/office/word/2012/wordml" xmlns:w16cei="http://schemas.microsoft.com/office/word/2026/wordml/cei" xmlns:w16cex="http://schemas.microsoft.com/office/word/2018/wordml/cex" xmlns:w16cid="http://schemas.microsoft.com/office/word/2016/wordml/cid" xmlns:w16="http://schemas.microsoft.com/office/word/2018/wordml" xmlns:w16du="http://schemas.microsoft.com/office/word/2023/wordml/word16du" xmlns:w16sdtdh="http://schemas.microsoft.com/office/word/2020/wordml/sdtdatahash" xmlns:w16sdtfl="http://schemas.microsoft.com/office/word/2024/wordml/sdtformatlock" xmlns:w16se="http://schemas.microsoft.com/office/word/2015/wordml/symex" xmlns:wpg="http://schemas.microsoft.com/office/word/2010/wordprocessingGroup" xmlns:wpi="http://schemas.microsoft.com/office/word/2010/wordprocessingInk" xmlns:wne="http://schemas.microsoft.com/office/word/2006/wordml" xmlns:wps="http://schemas.microsoft.com/office/word/2010/wordprocessingShape" mc:Ignorable="w14 w15 w16se w16cid w16 w16cex w16sdtdh w16sdtfl w16du wp14">
-  <w:p>
-    <w:pPr>
-      <w:pStyle w:val="Footer"/>
       <w:jc w:val="center"/>
-    </w:pPr>
-    <w:r>
-      <w:rPr>
-        <w:color w:val="5A626C"/>
-        <w:sz w:val="17"/>
-      </w:rPr>
-      <w:t xml:space="preserve">Ian Cumes · UVG 2026 · Pagina </w:t>
-    </w:r>
-    <w:r>
-      <w:fldChar w:fldCharType="begin"/>
-    </w:r>
-    <w:r>
-      <w:instrText>PAGE</w:instrText>
-    </w:r>
-    <w:r>
-      <w:fldChar w:fldCharType="separate"/>
-    </w:r>
-    <w:r>
-      <w:t>1</w:t>
-    </w:r>
-    <w:r>
-      <w:fldChar w:fldCharType="end"/>
-    </w:r>
-    <w:r>
-      <w:rPr>
-        <w:color w:val="5A626C"/>
-        <w:sz w:val="17"/>
-      </w:rPr>
-      <w:t xml:space="preserve"> de </w:t>
-    </w:r>
-    <w:r>
-      <w:fldChar w:fldCharType="begin"/>
-    </w:r>
-    <w:r>
-      <w:instrText>NUMPAGES</w:instrText>
-    </w:r>
-    <w:r>
-      <w:fldChar w:fldCharType="separate"/>
-    </w:r>
-    <w:r>
-      <w:t>1</w:t>
-    </w:r>
-    <w:r>
-      <w:fldChar w:fldCharType="end"/>
-    </w:r>
-  </w:p>
-</w:ftr>
-</file>
-
-<file path=word/footer3.xml><?xml version="1.0" encoding="utf-8"?>
-<w:ftr xmlns:wpc="http://schemas.microsoft.com/office/word/2010/wordprocessingCanvas" xmlns:cx="http://schemas.microsoft.com/office/drawing/2014/chartex" xmlns:cx1="http://schemas.microsoft.com/office/drawing/2015/9/8/chartex" xmlns:cx2="http://schemas.microsoft.com/office/drawing/2015/10/21/chartex" xmlns:cx3="http://schemas.microsoft.com/office/drawing/2016/5/9/chartex" xmlns:cx4="http://schemas.microsoft.com/office/drawing/2016/5/10/chartex" xmlns:cx5="http://schemas.microsoft.com/office/drawing/2016/5/11/chartex" xmlns:cx6="http://schemas.microsoft.com/office/drawing/2016/5/12/chartex" xmlns:cx7="http://schemas.microsoft.com/office/drawing/2016/5/13/chartex" xmlns:cx8="http://schemas.microsoft.com/office/drawing/2016/5/14/chartex" xmlns:mc="http://schemas.openxmlformats.org/markup-compatibility/2006" xmlns:aink="http://schemas.microsoft.com/office/drawing/2016/ink" xmlns:am3d="http://schemas.microsoft.com/office/drawing/2017/model3d" xmlns:o="urn:schemas-microsoft-com:office:office" xmlns:oel="http://schemas.microsoft.com/office/2019/extlst" xmlns:r="http://schemas.openxmlformats.org/officeDocument/2006/relationships" xmlns:m="http://schemas.openxmlformats.org/officeDocument/2006/math" xmlns:v="urn:schemas-microsoft-com:vml" xmlns:wp14="http://schemas.microsoft.com/office/word/2010/wordprocessingDrawing" xmlns:wp="http://schemas.openxmlformats.org/drawingml/2006/wordprocessingDrawing" xmlns:w10="urn:schemas-microsoft-com:office:word" xmlns:w="http://schemas.openxmlformats.org/wordprocessingml/2006/main" xmlns:w14="http://schemas.microsoft.com/office/word/2010/wordml" xmlns:w15="http://schemas.microsoft.com/office/word/2012/wordml" xmlns:w16cei="http://schemas.microsoft.com/office/word/2026/wordml/cei" xmlns:w16cex="http://schemas.microsoft.com/office/word/2018/wordml/cex" xmlns:w16cid="http://schemas.microsoft.com/office/word/2016/wordml/cid" xmlns:w16="http://schemas.microsoft.com/office/word/2018/wordml" xmlns:w16du="http://schemas.microsoft.com/office/word/2023/wordml/word16du" xmlns:w16sdtdh="http://schemas.microsoft.com/office/word/2020/wordml/sdtdatahash" xmlns:w16sdtfl="http://schemas.microsoft.com/office/word/2024/wordml/sdtformatlock" xmlns:w16se="http://schemas.microsoft.com/office/word/2015/wordml/symex" xmlns:wpg="http://schemas.microsoft.com/office/word/2010/wordprocessingGroup" xmlns:wpi="http://schemas.microsoft.com/office/word/2010/wordprocessingInk" xmlns:wne="http://schemas.microsoft.com/office/word/2006/wordml" xmlns:wps="http://schemas.microsoft.com/office/word/2010/wordprocessingShape" mc:Ignorable="w14 w15 w16se w16cid w16 w16cex w16sdtdh w16sdtfl w16du wp14">
-  <w:p>
-    <w:pPr>
-      <w:pStyle w:val="Footer"/>
     </w:pPr>
   </w:p>
 </w:ftr>
@@ -734,34 +2015,7 @@
   <w:p>
     <w:pPr>
       <w:pStyle w:val="Header"/>
-    </w:pPr>
-  </w:p>
-</w:hdr>
-</file>
-
-<file path=word/header2.xml><?xml version="1.0" encoding="utf-8"?>
-<w:hdr xmlns:wpc="http://schemas.microsoft.com/office/word/2010/wordprocessingCanvas" xmlns:cx="http://schemas.microsoft.com/office/drawing/2014/chartex" xmlns:cx1="http://schemas.microsoft.com/office/drawing/2015/9/8/chartex" xmlns:cx2="http://schemas.microsoft.com/office/drawing/2015/10/21/chartex" xmlns:cx3="http://schemas.microsoft.com/office/drawing/2016/5/9/chartex" xmlns:cx4="http://schemas.microsoft.com/office/drawing/2016/5/10/chartex" xmlns:cx5="http://schemas.microsoft.com/office/drawing/2016/5/11/chartex" xmlns:cx6="http://schemas.microsoft.com/office/drawing/2016/5/12/chartex" xmlns:cx7="http://schemas.microsoft.com/office/drawing/2016/5/13/chartex" xmlns:cx8="http://schemas.microsoft.com/office/drawing/2016/5/14/chartex" xmlns:mc="http://schemas.openxmlformats.org/markup-compatibility/2006" xmlns:aink="http://schemas.microsoft.com/office/drawing/2016/ink" xmlns:am3d="http://schemas.microsoft.com/office/drawing/2017/model3d" xmlns:o="urn:schemas-microsoft-com:office:office" xmlns:oel="http://schemas.microsoft.com/office/2019/extlst" xmlns:r="http://schemas.openxmlformats.org/officeDocument/2006/relationships" xmlns:m="http://schemas.openxmlformats.org/officeDocument/2006/math" xmlns:v="urn:schemas-microsoft-com:vml" xmlns:wp14="http://schemas.microsoft.com/office/word/2010/wordprocessingDrawing" xmlns:wp="http://schemas.openxmlformats.org/drawingml/2006/wordprocessingDrawing" xmlns:w10="urn:schemas-microsoft-com:office:word" xmlns:w="http://schemas.openxmlformats.org/wordprocessingml/2006/main" xmlns:w14="http://schemas.microsoft.com/office/word/2010/wordml" xmlns:w15="http://schemas.microsoft.com/office/word/2012/wordml" xmlns:w16cei="http://schemas.microsoft.com/office/word/2026/wordml/cei" xmlns:w16cex="http://schemas.microsoft.com/office/word/2018/wordml/cex" xmlns:w16cid="http://schemas.microsoft.com/office/word/2016/wordml/cid" xmlns:w16="http://schemas.microsoft.com/office/word/2018/wordml" xmlns:w16du="http://schemas.microsoft.com/office/word/2023/wordml/word16du" xmlns:w16sdtdh="http://schemas.microsoft.com/office/word/2020/wordml/sdtdatahash" xmlns:w16sdtfl="http://schemas.microsoft.com/office/word/2024/wordml/sdtformatlock" xmlns:w16se="http://schemas.microsoft.com/office/word/2015/wordml/symex" xmlns:wpg="http://schemas.microsoft.com/office/word/2010/wordprocessingGroup" xmlns:wpi="http://schemas.microsoft.com/office/word/2010/wordprocessingInk" xmlns:wne="http://schemas.microsoft.com/office/word/2006/wordml" xmlns:wps="http://schemas.microsoft.com/office/word/2010/wordprocessingShape" mc:Ignorable="w14 w15 w16se w16cid w16 w16cex w16sdtdh w16sdtfl w16du wp14">
-  <w:p>
-    <w:pPr>
-      <w:pStyle w:val="Header"/>
       <w:jc w:val="right"/>
-    </w:pPr>
-    <w:r>
-      <w:rPr>
-        <w:color w:val="5A626C"/>
-        <w:sz w:val="17"/>
-      </w:rPr>
-      <w:t>CONSTRUCCION DE COMPILADORES · LABORATORIO 3</w:t>
-    </w:r>
-  </w:p>
-</w:hdr>
-</file>
-
-<file path=word/header3.xml><?xml version="1.0" encoding="utf-8"?>
-<w:hdr xmlns:wpc="http://schemas.microsoft.com/office/word/2010/wordprocessingCanvas" xmlns:cx="http://schemas.microsoft.com/office/drawing/2014/chartex" xmlns:cx1="http://schemas.microsoft.com/office/drawing/2015/9/8/chartex" xmlns:cx2="http://schemas.microsoft.com/office/drawing/2015/10/21/chartex" xmlns:cx3="http://schemas.microsoft.com/office/drawing/2016/5/9/chartex" xmlns:cx4="http://schemas.microsoft.com/office/drawing/2016/5/10/chartex" xmlns:cx5="http://schemas.microsoft.com/office/drawing/2016/5/11/chartex" xmlns:cx6="http://schemas.microsoft.com/office/drawing/2016/5/12/chartex" xmlns:cx7="http://schemas.microsoft.com/office/drawing/2016/5/13/chartex" xmlns:cx8="http://schemas.microsoft.com/office/drawing/2016/5/14/chartex" xmlns:mc="http://schemas.openxmlformats.org/markup-compatibility/2006" xmlns:aink="http://schemas.microsoft.com/office/drawing/2016/ink" xmlns:am3d="http://schemas.microsoft.com/office/drawing/2017/model3d" xmlns:o="urn:schemas-microsoft-com:office:office" xmlns:oel="http://schemas.microsoft.com/office/2019/extlst" xmlns:r="http://schemas.openxmlformats.org/officeDocument/2006/relationships" xmlns:m="http://schemas.openxmlformats.org/officeDocument/2006/math" xmlns:v="urn:schemas-microsoft-com:vml" xmlns:wp14="http://schemas.microsoft.com/office/word/2010/wordprocessingDrawing" xmlns:wp="http://schemas.openxmlformats.org/drawingml/2006/wordprocessingDrawing" xmlns:w10="urn:schemas-microsoft-com:office:word" xmlns:w="http://schemas.openxmlformats.org/wordprocessingml/2006/main" xmlns:w14="http://schemas.microsoft.com/office/word/2010/wordml" xmlns:w15="http://schemas.microsoft.com/office/word/2012/wordml" xmlns:w16cei="http://schemas.microsoft.com/office/word/2026/wordml/cei" xmlns:w16cex="http://schemas.microsoft.com/office/word/2018/wordml/cex" xmlns:w16cid="http://schemas.microsoft.com/office/word/2016/wordml/cid" xmlns:w16="http://schemas.microsoft.com/office/word/2018/wordml" xmlns:w16du="http://schemas.microsoft.com/office/word/2023/wordml/word16du" xmlns:w16sdtdh="http://schemas.microsoft.com/office/word/2020/wordml/sdtdatahash" xmlns:w16sdtfl="http://schemas.microsoft.com/office/word/2024/wordml/sdtformatlock" xmlns:w16se="http://schemas.microsoft.com/office/word/2015/wordml/symex" xmlns:wpg="http://schemas.microsoft.com/office/word/2010/wordprocessingGroup" xmlns:wpi="http://schemas.microsoft.com/office/word/2010/wordprocessingInk" xmlns:wne="http://schemas.microsoft.com/office/word/2006/wordml" xmlns:wps="http://schemas.microsoft.com/office/word/2010/wordprocessingShape" mc:Ignorable="w14 w15 w16se w16cid w16 w16cex w16sdtdh w16sdtfl w16du wp14">
-  <w:p>
-    <w:pPr>
-      <w:pStyle w:val="Header"/>
     </w:pPr>
   </w:p>
 </w:hdr>

</xml_diff>